<commit_message>
Updating for A* scene switching
</commit_message>
<xml_diff>
--- a/Assessments/Assessment 3/Ben Timewell - F122A12 - 3. Test, Finalise, and Review a Prototype Game.docx
+++ b/Assessments/Assessment 3/Ben Timewell - F122A12 - 3. Test, Finalise, and Review a Prototype Game.docx
@@ -1,6 +1,6 @@
 
 <file path=word/document.xml><?xml version="1.0" encoding="utf-8"?>
-<w:document xmlns:wpc="http://schemas.microsoft.com/office/word/2010/wordprocessingCanvas" xmlns:cx="http://schemas.microsoft.com/office/drawing/2014/chartex" xmlns:cx1="http://schemas.microsoft.com/office/drawing/2015/9/8/chartex" xmlns:cx2="http://schemas.microsoft.com/office/drawing/2015/10/21/chartex" xmlns:cx3="http://schemas.microsoft.com/office/drawing/2016/5/9/chartex" xmlns:cx4="http://schemas.microsoft.com/office/drawing/2016/5/10/chartex" xmlns:cx5="http://schemas.microsoft.com/office/drawing/2016/5/11/chartex" xmlns:cx6="http://schemas.microsoft.com/office/drawing/2016/5/12/chartex" xmlns:cx7="http://schemas.microsoft.com/office/drawing/2016/5/13/chartex" xmlns:cx8="http://schemas.microsoft.com/office/drawing/2016/5/14/chartex" xmlns:mc="http://schemas.openxmlformats.org/markup-compatibility/2006" xmlns:aink="http://schemas.microsoft.com/office/drawing/2016/ink" xmlns:am3d="http://schemas.microsoft.com/office/drawing/2017/model3d" xmlns:o="urn:schemas-microsoft-com:office:office" xmlns:oel="http://schemas.microsoft.com/office/2019/extlst" xmlns:r="http://schemas.openxmlformats.org/officeDocument/2006/relationships" xmlns:m="http://schemas.openxmlformats.org/officeDocument/2006/math" xmlns:v="urn:schemas-microsoft-com:vml" xmlns:wp14="http://schemas.microsoft.com/office/word/2010/wordprocessingDrawing" xmlns:wp="http://schemas.openxmlformats.org/drawingml/2006/wordprocessingDrawing" xmlns:w10="urn:schemas-microsoft-com:office:word" xmlns:w="http://schemas.openxmlformats.org/wordprocessingml/2006/main" xmlns:w14="http://schemas.microsoft.com/office/word/2010/wordml" xmlns:w15="http://schemas.microsoft.com/office/word/2012/wordml" xmlns:w16cex="http://schemas.microsoft.com/office/word/2018/wordml/cex" xmlns:w16cid="http://schemas.microsoft.com/office/word/2016/wordml/cid" xmlns:w16="http://schemas.microsoft.com/office/word/2018/wordml" xmlns:w16sdtdh="http://schemas.microsoft.com/office/word/2020/wordml/sdtdatahash" xmlns:w16se="http://schemas.microsoft.com/office/word/2015/wordml/symex" xmlns:wpg="http://schemas.microsoft.com/office/word/2010/wordprocessingGroup" xmlns:wpi="http://schemas.microsoft.com/office/word/2010/wordprocessingInk" xmlns:wne="http://schemas.microsoft.com/office/word/2006/wordml" xmlns:wps="http://schemas.microsoft.com/office/word/2010/wordprocessingShape" mc:Ignorable="w14 w15 w16se w16cid w16 w16cex w16sdtdh wp14">
+<w:document xmlns:wpc="http://schemas.microsoft.com/office/word/2010/wordprocessingCanvas" xmlns:cx="http://schemas.microsoft.com/office/drawing/2014/chartex" xmlns:cx1="http://schemas.microsoft.com/office/drawing/2015/9/8/chartex" xmlns:cx2="http://schemas.microsoft.com/office/drawing/2015/10/21/chartex" xmlns:cx3="http://schemas.microsoft.com/office/drawing/2016/5/9/chartex" xmlns:cx4="http://schemas.microsoft.com/office/drawing/2016/5/10/chartex" xmlns:cx5="http://schemas.microsoft.com/office/drawing/2016/5/11/chartex" xmlns:cx6="http://schemas.microsoft.com/office/drawing/2016/5/12/chartex" xmlns:cx7="http://schemas.microsoft.com/office/drawing/2016/5/13/chartex" xmlns:cx8="http://schemas.microsoft.com/office/drawing/2016/5/14/chartex" xmlns:mc="http://schemas.openxmlformats.org/markup-compatibility/2006" xmlns:aink="http://schemas.microsoft.com/office/drawing/2016/ink" xmlns:am3d="http://schemas.microsoft.com/office/drawing/2017/model3d" xmlns:o="urn:schemas-microsoft-com:office:office" xmlns:oel="http://schemas.microsoft.com/office/2019/extlst" xmlns:r="http://schemas.openxmlformats.org/officeDocument/2006/relationships" xmlns:m="http://schemas.openxmlformats.org/officeDocument/2006/math" xmlns:v="urn:schemas-microsoft-com:vml" xmlns:wp14="http://schemas.microsoft.com/office/word/2010/wordprocessingDrawing" xmlns:wp="http://schemas.openxmlformats.org/drawingml/2006/wordprocessingDrawing" xmlns:w10="urn:schemas-microsoft-com:office:word" xmlns:w="http://schemas.openxmlformats.org/wordprocessingml/2006/main" xmlns:w14="http://schemas.microsoft.com/office/word/2010/wordml" xmlns:w15="http://schemas.microsoft.com/office/word/2012/wordml" xmlns:w16cex="http://schemas.microsoft.com/office/word/2018/wordml/cex" xmlns:w16cid="http://schemas.microsoft.com/office/word/2016/wordml/cid" xmlns:w16="http://schemas.microsoft.com/office/word/2018/wordml" xmlns:w16du="http://schemas.microsoft.com/office/word/2023/wordml/word16du" xmlns:w16sdtdh="http://schemas.microsoft.com/office/word/2020/wordml/sdtdatahash" xmlns:w16sdtfl="http://schemas.microsoft.com/office/word/2024/wordml/sdtformatlock" xmlns:w16se="http://schemas.microsoft.com/office/word/2015/wordml/symex" xmlns:wpg="http://schemas.microsoft.com/office/word/2010/wordprocessingGroup" xmlns:wpi="http://schemas.microsoft.com/office/word/2010/wordprocessingInk" xmlns:wne="http://schemas.microsoft.com/office/word/2006/wordml" xmlns:wps="http://schemas.microsoft.com/office/word/2010/wordprocessingShape" mc:Ignorable="w14 w15 w16se w16cid w16 w16cex w16sdtdh w16sdtfl w16du wp14">
   <w:body>
     <w:p>
       <w:pPr>
@@ -89,7 +89,6 @@
             <w14:uncheckedState w14:val="2610" w14:font="MS Gothic"/>
           </w14:checkbox>
         </w:sdtPr>
-        <w:sdtEndPr/>
         <w:sdtContent>
           <w:r>
             <w:rPr>
@@ -128,7 +127,6 @@
             <w14:uncheckedState w14:val="2610" w14:font="MS Gothic"/>
           </w14:checkbox>
         </w:sdtPr>
-        <w:sdtEndPr/>
         <w:sdtContent>
           <w:r>
             <w:rPr>
@@ -167,7 +165,6 @@
             <w14:uncheckedState w14:val="2610" w14:font="MS Gothic"/>
           </w14:checkbox>
         </w:sdtPr>
-        <w:sdtEndPr/>
         <w:sdtContent>
           <w:r>
             <w:rPr>
@@ -217,7 +214,6 @@
             <w14:uncheckedState w14:val="2610" w14:font="MS Gothic"/>
           </w14:checkbox>
         </w:sdtPr>
-        <w:sdtEndPr/>
         <w:sdtContent>
           <w:r>
             <w:rPr>
@@ -1008,15 +1004,7 @@
           </w:tcPr>
           <w:p>
             <w:r>
-              <w:t xml:space="preserve">The plan for my tests </w:t>
-            </w:r>
-            <w:proofErr w:type="gramStart"/>
-            <w:r>
-              <w:t>are</w:t>
-            </w:r>
-            <w:proofErr w:type="gramEnd"/>
-            <w:r>
-              <w:t>:</w:t>
+              <w:t>The plan for my tests are:</w:t>
             </w:r>
           </w:p>
           <w:p/>
@@ -1089,15 +1077,7 @@
               </w:numPr>
             </w:pPr>
             <w:r>
-              <w:t xml:space="preserve">In terms of testing the GUI – I’ll remove delays between camera transitions and any blocking logic, allowing the tester to quickly try functionality without waiting for movement / </w:t>
-            </w:r>
-            <w:proofErr w:type="gramStart"/>
-            <w:r>
-              <w:t>bool’s</w:t>
-            </w:r>
-            <w:proofErr w:type="gramEnd"/>
-            <w:r>
-              <w:t xml:space="preserve"> to become true, etc</w:t>
+              <w:t>In terms of testing the GUI – I’ll remove delays between camera transitions and any blocking logic, allowing the tester to quickly try functionality without waiting for movement / bool’s to become true, etc</w:t>
             </w:r>
           </w:p>
         </w:tc>
@@ -1942,23 +1922,7 @@
                 <w:rFonts w:ascii="Calibri" w:eastAsia="Calibri" w:hAnsi="Calibri" w:cs="Times New Roman"/>
                 <w:szCs w:val="22"/>
               </w:rPr>
-              <w:t xml:space="preserve">The game provided instructions, </w:t>
-            </w:r>
-            <w:proofErr w:type="gramStart"/>
-            <w:r>
-              <w:rPr>
-                <w:rFonts w:ascii="Calibri" w:eastAsia="Calibri" w:hAnsi="Calibri" w:cs="Times New Roman"/>
-                <w:szCs w:val="22"/>
-              </w:rPr>
-              <w:t>yes</w:t>
-            </w:r>
-            <w:proofErr w:type="gramEnd"/>
-            <w:r>
-              <w:rPr>
-                <w:rFonts w:ascii="Calibri" w:eastAsia="Calibri" w:hAnsi="Calibri" w:cs="Times New Roman"/>
-                <w:szCs w:val="22"/>
-              </w:rPr>
-              <w:t xml:space="preserve"> they were helpful. Run around, chase the aliens, spawn more aliens, all explained at the start.</w:t>
+              <w:t>The game provided instructions, yes they were helpful. Run around, chase the aliens, spawn more aliens, all explained at the start.</w:t>
             </w:r>
           </w:p>
           <w:p>
@@ -2034,23 +1998,7 @@
                 <w:rFonts w:ascii="Calibri" w:eastAsia="Calibri" w:hAnsi="Calibri" w:cs="Times New Roman"/>
                 <w:szCs w:val="22"/>
               </w:rPr>
-              <w:t xml:space="preserve">Invert mouse </w:t>
-            </w:r>
-            <w:proofErr w:type="spellStart"/>
-            <w:r>
-              <w:rPr>
-                <w:rFonts w:ascii="Calibri" w:eastAsia="Calibri" w:hAnsi="Calibri" w:cs="Times New Roman"/>
-                <w:szCs w:val="22"/>
-              </w:rPr>
-              <w:t>controlssss</w:t>
-            </w:r>
-            <w:proofErr w:type="spellEnd"/>
-            <w:r>
-              <w:rPr>
-                <w:rFonts w:ascii="Calibri" w:eastAsia="Calibri" w:hAnsi="Calibri" w:cs="Times New Roman"/>
-                <w:szCs w:val="22"/>
-              </w:rPr>
-              <w:t>!! And maybe that chicken could waddle a bit faster?</w:t>
+              <w:t>Invert mouse controlssss!! And maybe that chicken could waddle a bit faster?</w:t>
             </w:r>
           </w:p>
           <w:p>
@@ -2482,23 +2430,7 @@
                 <w:rFonts w:ascii="Calibri" w:eastAsia="Calibri" w:hAnsi="Calibri" w:cs="Times New Roman"/>
                 <w:szCs w:val="22"/>
               </w:rPr>
-              <w:t xml:space="preserve">and </w:t>
-            </w:r>
-            <w:proofErr w:type="spellStart"/>
-            <w:r>
-              <w:rPr>
-                <w:rFonts w:ascii="Calibri" w:eastAsia="Calibri" w:hAnsi="Calibri" w:cs="Times New Roman"/>
-                <w:szCs w:val="22"/>
-              </w:rPr>
-              <w:t>well structured</w:t>
-            </w:r>
-            <w:proofErr w:type="spellEnd"/>
-            <w:r>
-              <w:rPr>
-                <w:rFonts w:ascii="Calibri" w:eastAsia="Calibri" w:hAnsi="Calibri" w:cs="Times New Roman"/>
-                <w:szCs w:val="22"/>
-              </w:rPr>
-              <w:t xml:space="preserve"> to play the game without further information needed</w:t>
+              <w:t>and well structured to play the game without further information needed</w:t>
             </w:r>
           </w:p>
           <w:p>
@@ -4786,25 +4718,7 @@
                 <w:bCs w:val="0"/>
                 <w:iCs/>
               </w:rPr>
-              <w:t xml:space="preserve"> – </w:t>
-            </w:r>
-            <w:proofErr w:type="spellStart"/>
-            <w:r>
-              <w:rPr>
-                <w:b/>
-                <w:bCs w:val="0"/>
-                <w:iCs/>
-              </w:rPr>
-              <w:t>Gameplay</w:t>
-            </w:r>
-            <w:proofErr w:type="spellEnd"/>
-            <w:r>
-              <w:rPr>
-                <w:b/>
-                <w:bCs w:val="0"/>
-                <w:iCs/>
-              </w:rPr>
-              <w:t xml:space="preserve"> field</w:t>
+              <w:t xml:space="preserve"> – Gameplay field</w:t>
             </w:r>
           </w:p>
           <w:p>
@@ -5423,15 +5337,7 @@
         <w:t xml:space="preserve">In terms of the order, I made the new menu items first as that was a core item that was needed regardless of the theme of the game, and once that plus the logic behind it was working, I went about making a new landscape. While searching for “wood” related assets, like logging machines / chain saws / lumberjacks, I found I didn’t overly like the theme and opted to go for a farm yard instead. Since I was using my original “PTSD Chicken” (As Tom calls them) asset, from the prototype, I decided to turn them into “aliens disguised as chickens”. </w:t>
       </w:r>
       <w:r>
-        <w:t xml:space="preserve">Once I had that idea locked in, I made a space ship asset for them to arrive in and started building the world environment. This included putting down trees, random farm yard things, setting up fences, making the world become a world essentially. After the world was constructed, I setup the </w:t>
-      </w:r>
-      <w:proofErr w:type="gramStart"/>
-      <w:r>
-        <w:t>player controlled</w:t>
-      </w:r>
-      <w:proofErr w:type="gramEnd"/>
-      <w:r>
-        <w:t xml:space="preserve"> chicken, so the player can explore the world. At that point, it was down to testing and adjusting.</w:t>
+        <w:t>Once I had that idea locked in, I made a space ship asset for them to arrive in and started building the world environment. This included putting down trees, random farm yard things, setting up fences, making the world become a world essentially. After the world was constructed, I setup the player controlled chicken, so the player can explore the world. At that point, it was down to testing and adjusting.</w:t>
       </w:r>
     </w:p>
     <w:p>
@@ -5628,15 +5534,7 @@
           </w:tcPr>
           <w:p>
             <w:r>
-              <w:t xml:space="preserve">3D animations are implemented by the various NPC animals around the farm. They have idle animations that play on a loop, and the </w:t>
-            </w:r>
-            <w:proofErr w:type="gramStart"/>
-            <w:r>
-              <w:t>player controlled</w:t>
-            </w:r>
-            <w:proofErr w:type="gramEnd"/>
-            <w:r>
-              <w:t xml:space="preserve"> chicken also animates while walking around / also has idle animations.</w:t>
+              <w:t>3D animations are implemented by the various NPC animals around the farm. They have idle animations that play on a loop, and the player controlled chicken also animates while walking around / also has idle animations.</w:t>
             </w:r>
           </w:p>
           <w:p/>
@@ -5674,15 +5572,7 @@
           </w:tcPr>
           <w:p>
             <w:r>
-              <w:t>There are a few sounds in the game. There is background music that plays on a loop, the spaceship when landing plays a “</w:t>
-            </w:r>
-            <w:proofErr w:type="spellStart"/>
-            <w:r>
-              <w:t>wooooshhh</w:t>
-            </w:r>
-            <w:proofErr w:type="spellEnd"/>
-            <w:r>
-              <w:t>” sound and the various NPC animals make animal noises. All sound is controlled by an audio mixer, with separate controls for music and SFX sounds.</w:t>
+              <w:t>There are a few sounds in the game. There is background music that plays on a loop, the spaceship when landing plays a “wooooshhh” sound and the various NPC animals make animal noises. All sound is controlled by an audio mixer, with separate controls for music and SFX sounds.</w:t>
             </w:r>
           </w:p>
         </w:tc>
@@ -5810,11 +5700,9 @@
             <w:pPr>
               <w:ind w:left="720"/>
             </w:pPr>
-            <w:proofErr w:type="spellStart"/>
             <w:r>
               <w:t>Navmesh</w:t>
             </w:r>
-            <w:proofErr w:type="spellEnd"/>
           </w:p>
           <w:p>
             <w:pPr>
@@ -5843,74 +5731,22 @@
               <w:t>–</w:t>
             </w:r>
             <w:r>
-              <w:t xml:space="preserve"> </w:t>
-            </w:r>
-            <w:proofErr w:type="spellStart"/>
-            <w:r>
-              <w:t>NavMesh</w:t>
-            </w:r>
-            <w:proofErr w:type="spellEnd"/>
-            <w:r>
-              <w:t xml:space="preserve">) uses </w:t>
-            </w:r>
-            <w:proofErr w:type="spellStart"/>
-            <w:r>
-              <w:t>NavMesh</w:t>
-            </w:r>
-            <w:proofErr w:type="spellEnd"/>
-            <w:r>
-              <w:t xml:space="preserve"> for </w:t>
-            </w:r>
-            <w:proofErr w:type="spellStart"/>
-            <w:proofErr w:type="gramStart"/>
-            <w:r>
-              <w:t>it’s</w:t>
-            </w:r>
-            <w:proofErr w:type="spellEnd"/>
-            <w:proofErr w:type="gramEnd"/>
-            <w:r>
-              <w:t xml:space="preserve"> path finding. The </w:t>
-            </w:r>
-            <w:proofErr w:type="spellStart"/>
-            <w:r>
-              <w:t>NavMesh</w:t>
-            </w:r>
-            <w:proofErr w:type="spellEnd"/>
-            <w:r>
-              <w:t xml:space="preserve"> surface is added to the “Ground” game object, located in Level -&gt; </w:t>
-            </w:r>
-            <w:proofErr w:type="spellStart"/>
-            <w:r>
-              <w:t>Enviroment</w:t>
-            </w:r>
-            <w:proofErr w:type="spellEnd"/>
-            <w:r>
-              <w:t xml:space="preserve"> -&gt; Terrain within the scene. Then the Prefab “NPC” has the </w:t>
-            </w:r>
-            <w:proofErr w:type="spellStart"/>
-            <w:r>
-              <w:t>NavMesh</w:t>
-            </w:r>
-            <w:proofErr w:type="spellEnd"/>
-            <w:r>
-              <w:t xml:space="preserve"> agent component added to it.</w:t>
+              <w:t xml:space="preserve"> NavMesh</w:t>
+            </w:r>
+            <w:r>
+              <w:t>) uses NavMesh for it’s path finding. The NavMesh surface is added to the “Ground” game object, located in Level -&gt; Enviroment -&gt; Terrain within the scene. Then the Prefab “NPC” has the NavMesh agent component added to it.</w:t>
             </w:r>
           </w:p>
           <w:p/>
           <w:p>
             <w:r>
-              <w:t xml:space="preserve">A* Pathfinding was implemented in the “Prototype – </w:t>
-            </w:r>
-            <w:proofErr w:type="spellStart"/>
-            <w:r>
-              <w:t>Astar</w:t>
-            </w:r>
-            <w:proofErr w:type="spellEnd"/>
-            <w:r>
-              <w:t>” scene</w:t>
+              <w:t>A* Pathfinding was implemented in the “Prototype – Astar” scene</w:t>
             </w:r>
             <w:r>
               <w:t>. This is the basic prototype of the game, graphics and world space have not been updated in this scene, but it does use A* Pathfinding.</w:t>
+            </w:r>
+            <w:r>
+              <w:t xml:space="preserve"> Switching scenes is done by pressing the A* button on the main screen, and then the NavMesh button on the A* prototype scene.</w:t>
             </w:r>
           </w:p>
         </w:tc>
@@ -5974,15 +5810,7 @@
           </w:tcPr>
           <w:p>
             <w:r>
-              <w:t xml:space="preserve">I am tracking the stolen eggs. This is done by having the “Inventory Displayer” script attached to the spaceship game object. It observes the </w:t>
-            </w:r>
-            <w:proofErr w:type="gramStart"/>
-            <w:r>
-              <w:t>amount</w:t>
-            </w:r>
-            <w:proofErr w:type="gramEnd"/>
-            <w:r>
-              <w:t xml:space="preserve"> of stolen eggs inside the spaceship inventory and displays the total amount in the top middle of the screen. This is also the win condition script, once 50 or more eggs are in the inventory, the win screen appears</w:t>
+              <w:t>I am tracking the stolen eggs. This is done by having the “Inventory Displayer” script attached to the spaceship game object. It observes the amount of stolen eggs inside the spaceship inventory and displays the total amount in the top middle of the screen. This is also the win condition script, once 50 or more eggs are in the inventory, the win screen appears</w:t>
             </w:r>
           </w:p>
         </w:tc>
@@ -6131,6 +5959,7 @@
           </w:p>
           <w:p>
             <w:r>
+              <w:lastRenderedPageBreak/>
               <w:t>- Buckets: These are needed to steal the eggs. Aliens will go and get them before attempted to steal eggs.</w:t>
             </w:r>
           </w:p>
@@ -6358,15 +6187,7 @@
               <w:t>There are animal NPCs, but they’re more assets than actual GOAP AI NPCs</w:t>
             </w:r>
             <w:r>
-              <w:t xml:space="preserve">. They do however have a </w:t>
-            </w:r>
-            <w:proofErr w:type="spellStart"/>
-            <w:r>
-              <w:t>NavMesh</w:t>
-            </w:r>
-            <w:proofErr w:type="spellEnd"/>
-            <w:r>
-              <w:t xml:space="preserve"> agent added and have waypoints they walk around to. There’s no logic in them, just move to position X, avoid obstacles, then move to position Y.</w:t>
+              <w:t>. They do however have a NavMesh agent added and have waypoints they walk around to. There’s no logic in them, just move to position X, avoid obstacles, then move to position Y.</w:t>
             </w:r>
           </w:p>
         </w:tc>
@@ -6509,7 +6330,7 @@
 </file>
 
 <file path=word/endnotes.xml><?xml version="1.0" encoding="utf-8"?>
-<w:endnotes xmlns:wpc="http://schemas.microsoft.com/office/word/2010/wordprocessingCanvas" xmlns:cx="http://schemas.microsoft.com/office/drawing/2014/chartex" xmlns:cx1="http://schemas.microsoft.com/office/drawing/2015/9/8/chartex" xmlns:cx2="http://schemas.microsoft.com/office/drawing/2015/10/21/chartex" xmlns:cx3="http://schemas.microsoft.com/office/drawing/2016/5/9/chartex" xmlns:cx4="http://schemas.microsoft.com/office/drawing/2016/5/10/chartex" xmlns:cx5="http://schemas.microsoft.com/office/drawing/2016/5/11/chartex" xmlns:cx6="http://schemas.microsoft.com/office/drawing/2016/5/12/chartex" xmlns:cx7="http://schemas.microsoft.com/office/drawing/2016/5/13/chartex" xmlns:cx8="http://schemas.microsoft.com/office/drawing/2016/5/14/chartex" xmlns:mc="http://schemas.openxmlformats.org/markup-compatibility/2006" xmlns:aink="http://schemas.microsoft.com/office/drawing/2016/ink" xmlns:am3d="http://schemas.microsoft.com/office/drawing/2017/model3d" xmlns:o="urn:schemas-microsoft-com:office:office" xmlns:oel="http://schemas.microsoft.com/office/2019/extlst" xmlns:r="http://schemas.openxmlformats.org/officeDocument/2006/relationships" xmlns:m="http://schemas.openxmlformats.org/officeDocument/2006/math" xmlns:v="urn:schemas-microsoft-com:vml" xmlns:wp14="http://schemas.microsoft.com/office/word/2010/wordprocessingDrawing" xmlns:wp="http://schemas.openxmlformats.org/drawingml/2006/wordprocessingDrawing" xmlns:w10="urn:schemas-microsoft-com:office:word" xmlns:w="http://schemas.openxmlformats.org/wordprocessingml/2006/main" xmlns:w14="http://schemas.microsoft.com/office/word/2010/wordml" xmlns:w15="http://schemas.microsoft.com/office/word/2012/wordml" xmlns:w16cex="http://schemas.microsoft.com/office/word/2018/wordml/cex" xmlns:w16cid="http://schemas.microsoft.com/office/word/2016/wordml/cid" xmlns:w16="http://schemas.microsoft.com/office/word/2018/wordml" xmlns:w16sdtdh="http://schemas.microsoft.com/office/word/2020/wordml/sdtdatahash" xmlns:w16se="http://schemas.microsoft.com/office/word/2015/wordml/symex" xmlns:wpg="http://schemas.microsoft.com/office/word/2010/wordprocessingGroup" xmlns:wpi="http://schemas.microsoft.com/office/word/2010/wordprocessingInk" xmlns:wne="http://schemas.microsoft.com/office/word/2006/wordml" xmlns:wps="http://schemas.microsoft.com/office/word/2010/wordprocessingShape" mc:Ignorable="w14 w15 w16se w16cid w16 w16cex w16sdtdh wp14">
+<w:endnotes xmlns:wpc="http://schemas.microsoft.com/office/word/2010/wordprocessingCanvas" xmlns:cx="http://schemas.microsoft.com/office/drawing/2014/chartex" xmlns:cx1="http://schemas.microsoft.com/office/drawing/2015/9/8/chartex" xmlns:cx2="http://schemas.microsoft.com/office/drawing/2015/10/21/chartex" xmlns:cx3="http://schemas.microsoft.com/office/drawing/2016/5/9/chartex" xmlns:cx4="http://schemas.microsoft.com/office/drawing/2016/5/10/chartex" xmlns:cx5="http://schemas.microsoft.com/office/drawing/2016/5/11/chartex" xmlns:cx6="http://schemas.microsoft.com/office/drawing/2016/5/12/chartex" xmlns:cx7="http://schemas.microsoft.com/office/drawing/2016/5/13/chartex" xmlns:cx8="http://schemas.microsoft.com/office/drawing/2016/5/14/chartex" xmlns:mc="http://schemas.openxmlformats.org/markup-compatibility/2006" xmlns:aink="http://schemas.microsoft.com/office/drawing/2016/ink" xmlns:am3d="http://schemas.microsoft.com/office/drawing/2017/model3d" xmlns:o="urn:schemas-microsoft-com:office:office" xmlns:oel="http://schemas.microsoft.com/office/2019/extlst" xmlns:r="http://schemas.openxmlformats.org/officeDocument/2006/relationships" xmlns:m="http://schemas.openxmlformats.org/officeDocument/2006/math" xmlns:v="urn:schemas-microsoft-com:vml" xmlns:wp14="http://schemas.microsoft.com/office/word/2010/wordprocessingDrawing" xmlns:wp="http://schemas.openxmlformats.org/drawingml/2006/wordprocessingDrawing" xmlns:w10="urn:schemas-microsoft-com:office:word" xmlns:w="http://schemas.openxmlformats.org/wordprocessingml/2006/main" xmlns:w14="http://schemas.microsoft.com/office/word/2010/wordml" xmlns:w15="http://schemas.microsoft.com/office/word/2012/wordml" xmlns:w16cex="http://schemas.microsoft.com/office/word/2018/wordml/cex" xmlns:w16cid="http://schemas.microsoft.com/office/word/2016/wordml/cid" xmlns:w16="http://schemas.microsoft.com/office/word/2018/wordml" xmlns:w16du="http://schemas.microsoft.com/office/word/2023/wordml/word16du" xmlns:w16sdtdh="http://schemas.microsoft.com/office/word/2020/wordml/sdtdatahash" xmlns:w16sdtfl="http://schemas.microsoft.com/office/word/2024/wordml/sdtformatlock" xmlns:w16se="http://schemas.microsoft.com/office/word/2015/wordml/symex" xmlns:wpg="http://schemas.microsoft.com/office/word/2010/wordprocessingGroup" xmlns:wpi="http://schemas.microsoft.com/office/word/2010/wordprocessingInk" xmlns:wne="http://schemas.microsoft.com/office/word/2006/wordml" xmlns:wps="http://schemas.microsoft.com/office/word/2010/wordprocessingShape" mc:Ignorable="w14 w15 w16se w16cid w16 w16cex w16sdtdh w16sdtfl w16du wp14">
   <w:endnote w:type="separator" w:id="-1">
     <w:p>
       <w:r>
@@ -6528,7 +6349,7 @@
 </file>
 
 <file path=word/footer1.xml><?xml version="1.0" encoding="utf-8"?>
-<w:ftr xmlns:wpc="http://schemas.microsoft.com/office/word/2010/wordprocessingCanvas" xmlns:cx="http://schemas.microsoft.com/office/drawing/2014/chartex" xmlns:cx1="http://schemas.microsoft.com/office/drawing/2015/9/8/chartex" xmlns:cx2="http://schemas.microsoft.com/office/drawing/2015/10/21/chartex" xmlns:cx3="http://schemas.microsoft.com/office/drawing/2016/5/9/chartex" xmlns:cx4="http://schemas.microsoft.com/office/drawing/2016/5/10/chartex" xmlns:cx5="http://schemas.microsoft.com/office/drawing/2016/5/11/chartex" xmlns:cx6="http://schemas.microsoft.com/office/drawing/2016/5/12/chartex" xmlns:cx7="http://schemas.microsoft.com/office/drawing/2016/5/13/chartex" xmlns:cx8="http://schemas.microsoft.com/office/drawing/2016/5/14/chartex" xmlns:mc="http://schemas.openxmlformats.org/markup-compatibility/2006" xmlns:aink="http://schemas.microsoft.com/office/drawing/2016/ink" xmlns:am3d="http://schemas.microsoft.com/office/drawing/2017/model3d" xmlns:o="urn:schemas-microsoft-com:office:office" xmlns:oel="http://schemas.microsoft.com/office/2019/extlst" xmlns:r="http://schemas.openxmlformats.org/officeDocument/2006/relationships" xmlns:m="http://schemas.openxmlformats.org/officeDocument/2006/math" xmlns:v="urn:schemas-microsoft-com:vml" xmlns:wp14="http://schemas.microsoft.com/office/word/2010/wordprocessingDrawing" xmlns:wp="http://schemas.openxmlformats.org/drawingml/2006/wordprocessingDrawing" xmlns:w10="urn:schemas-microsoft-com:office:word" xmlns:w="http://schemas.openxmlformats.org/wordprocessingml/2006/main" xmlns:w14="http://schemas.microsoft.com/office/word/2010/wordml" xmlns:w15="http://schemas.microsoft.com/office/word/2012/wordml" xmlns:w16cex="http://schemas.microsoft.com/office/word/2018/wordml/cex" xmlns:w16cid="http://schemas.microsoft.com/office/word/2016/wordml/cid" xmlns:w16="http://schemas.microsoft.com/office/word/2018/wordml" xmlns:w16sdtdh="http://schemas.microsoft.com/office/word/2020/wordml/sdtdatahash" xmlns:w16se="http://schemas.microsoft.com/office/word/2015/wordml/symex" xmlns:wpg="http://schemas.microsoft.com/office/word/2010/wordprocessingGroup" xmlns:wpi="http://schemas.microsoft.com/office/word/2010/wordprocessingInk" xmlns:wne="http://schemas.microsoft.com/office/word/2006/wordml" xmlns:wps="http://schemas.microsoft.com/office/word/2010/wordprocessingShape" mc:Ignorable="w14 w15 w16se w16cid w16 w16cex w16sdtdh wp14">
+<w:ftr xmlns:wpc="http://schemas.microsoft.com/office/word/2010/wordprocessingCanvas" xmlns:cx="http://schemas.microsoft.com/office/drawing/2014/chartex" xmlns:cx1="http://schemas.microsoft.com/office/drawing/2015/9/8/chartex" xmlns:cx2="http://schemas.microsoft.com/office/drawing/2015/10/21/chartex" xmlns:cx3="http://schemas.microsoft.com/office/drawing/2016/5/9/chartex" xmlns:cx4="http://schemas.microsoft.com/office/drawing/2016/5/10/chartex" xmlns:cx5="http://schemas.microsoft.com/office/drawing/2016/5/11/chartex" xmlns:cx6="http://schemas.microsoft.com/office/drawing/2016/5/12/chartex" xmlns:cx7="http://schemas.microsoft.com/office/drawing/2016/5/13/chartex" xmlns:cx8="http://schemas.microsoft.com/office/drawing/2016/5/14/chartex" xmlns:mc="http://schemas.openxmlformats.org/markup-compatibility/2006" xmlns:aink="http://schemas.microsoft.com/office/drawing/2016/ink" xmlns:am3d="http://schemas.microsoft.com/office/drawing/2017/model3d" xmlns:o="urn:schemas-microsoft-com:office:office" xmlns:oel="http://schemas.microsoft.com/office/2019/extlst" xmlns:r="http://schemas.openxmlformats.org/officeDocument/2006/relationships" xmlns:m="http://schemas.openxmlformats.org/officeDocument/2006/math" xmlns:v="urn:schemas-microsoft-com:vml" xmlns:wp14="http://schemas.microsoft.com/office/word/2010/wordprocessingDrawing" xmlns:wp="http://schemas.openxmlformats.org/drawingml/2006/wordprocessingDrawing" xmlns:w10="urn:schemas-microsoft-com:office:word" xmlns:w="http://schemas.openxmlformats.org/wordprocessingml/2006/main" xmlns:w14="http://schemas.microsoft.com/office/word/2010/wordml" xmlns:w15="http://schemas.microsoft.com/office/word/2012/wordml" xmlns:w16cex="http://schemas.microsoft.com/office/word/2018/wordml/cex" xmlns:w16cid="http://schemas.microsoft.com/office/word/2016/wordml/cid" xmlns:w16="http://schemas.microsoft.com/office/word/2018/wordml" xmlns:w16du="http://schemas.microsoft.com/office/word/2023/wordml/word16du" xmlns:w16sdtdh="http://schemas.microsoft.com/office/word/2020/wordml/sdtdatahash" xmlns:w16sdtfl="http://schemas.microsoft.com/office/word/2024/wordml/sdtformatlock" xmlns:w16se="http://schemas.microsoft.com/office/word/2015/wordml/symex" xmlns:wpg="http://schemas.microsoft.com/office/word/2010/wordprocessingGroup" xmlns:wpi="http://schemas.microsoft.com/office/word/2010/wordprocessingInk" xmlns:wne="http://schemas.microsoft.com/office/word/2006/wordml" xmlns:wps="http://schemas.microsoft.com/office/word/2010/wordprocessingShape" mc:Ignorable="w14 w15 w16se w16cid w16 w16cex w16sdtdh w16sdtfl w16du wp14">
   <w:tbl>
     <w:tblPr>
       <w:tblStyle w:val="TableGrid3"/>
@@ -6739,7 +6560,6 @@
               <w:showingPlcHdr/>
               <w:text/>
             </w:sdtPr>
-            <w:sdtEndPr/>
             <w:sdtContent>
               <w:r>
                 <w:rPr>
@@ -6951,7 +6771,7 @@
 </file>
 
 <file path=word/footnotes.xml><?xml version="1.0" encoding="utf-8"?>
-<w:footnotes xmlns:wpc="http://schemas.microsoft.com/office/word/2010/wordprocessingCanvas" xmlns:cx="http://schemas.microsoft.com/office/drawing/2014/chartex" xmlns:cx1="http://schemas.microsoft.com/office/drawing/2015/9/8/chartex" xmlns:cx2="http://schemas.microsoft.com/office/drawing/2015/10/21/chartex" xmlns:cx3="http://schemas.microsoft.com/office/drawing/2016/5/9/chartex" xmlns:cx4="http://schemas.microsoft.com/office/drawing/2016/5/10/chartex" xmlns:cx5="http://schemas.microsoft.com/office/drawing/2016/5/11/chartex" xmlns:cx6="http://schemas.microsoft.com/office/drawing/2016/5/12/chartex" xmlns:cx7="http://schemas.microsoft.com/office/drawing/2016/5/13/chartex" xmlns:cx8="http://schemas.microsoft.com/office/drawing/2016/5/14/chartex" xmlns:mc="http://schemas.openxmlformats.org/markup-compatibility/2006" xmlns:aink="http://schemas.microsoft.com/office/drawing/2016/ink" xmlns:am3d="http://schemas.microsoft.com/office/drawing/2017/model3d" xmlns:o="urn:schemas-microsoft-com:office:office" xmlns:oel="http://schemas.microsoft.com/office/2019/extlst" xmlns:r="http://schemas.openxmlformats.org/officeDocument/2006/relationships" xmlns:m="http://schemas.openxmlformats.org/officeDocument/2006/math" xmlns:v="urn:schemas-microsoft-com:vml" xmlns:wp14="http://schemas.microsoft.com/office/word/2010/wordprocessingDrawing" xmlns:wp="http://schemas.openxmlformats.org/drawingml/2006/wordprocessingDrawing" xmlns:w10="urn:schemas-microsoft-com:office:word" xmlns:w="http://schemas.openxmlformats.org/wordprocessingml/2006/main" xmlns:w14="http://schemas.microsoft.com/office/word/2010/wordml" xmlns:w15="http://schemas.microsoft.com/office/word/2012/wordml" xmlns:w16cex="http://schemas.microsoft.com/office/word/2018/wordml/cex" xmlns:w16cid="http://schemas.microsoft.com/office/word/2016/wordml/cid" xmlns:w16="http://schemas.microsoft.com/office/word/2018/wordml" xmlns:w16sdtdh="http://schemas.microsoft.com/office/word/2020/wordml/sdtdatahash" xmlns:w16se="http://schemas.microsoft.com/office/word/2015/wordml/symex" xmlns:wpg="http://schemas.microsoft.com/office/word/2010/wordprocessingGroup" xmlns:wpi="http://schemas.microsoft.com/office/word/2010/wordprocessingInk" xmlns:wne="http://schemas.microsoft.com/office/word/2006/wordml" xmlns:wps="http://schemas.microsoft.com/office/word/2010/wordprocessingShape" mc:Ignorable="w14 w15 w16se w16cid w16 w16cex w16sdtdh wp14">
+<w:footnotes xmlns:wpc="http://schemas.microsoft.com/office/word/2010/wordprocessingCanvas" xmlns:cx="http://schemas.microsoft.com/office/drawing/2014/chartex" xmlns:cx1="http://schemas.microsoft.com/office/drawing/2015/9/8/chartex" xmlns:cx2="http://schemas.microsoft.com/office/drawing/2015/10/21/chartex" xmlns:cx3="http://schemas.microsoft.com/office/drawing/2016/5/9/chartex" xmlns:cx4="http://schemas.microsoft.com/office/drawing/2016/5/10/chartex" xmlns:cx5="http://schemas.microsoft.com/office/drawing/2016/5/11/chartex" xmlns:cx6="http://schemas.microsoft.com/office/drawing/2016/5/12/chartex" xmlns:cx7="http://schemas.microsoft.com/office/drawing/2016/5/13/chartex" xmlns:cx8="http://schemas.microsoft.com/office/drawing/2016/5/14/chartex" xmlns:mc="http://schemas.openxmlformats.org/markup-compatibility/2006" xmlns:aink="http://schemas.microsoft.com/office/drawing/2016/ink" xmlns:am3d="http://schemas.microsoft.com/office/drawing/2017/model3d" xmlns:o="urn:schemas-microsoft-com:office:office" xmlns:oel="http://schemas.microsoft.com/office/2019/extlst" xmlns:r="http://schemas.openxmlformats.org/officeDocument/2006/relationships" xmlns:m="http://schemas.openxmlformats.org/officeDocument/2006/math" xmlns:v="urn:schemas-microsoft-com:vml" xmlns:wp14="http://schemas.microsoft.com/office/word/2010/wordprocessingDrawing" xmlns:wp="http://schemas.openxmlformats.org/drawingml/2006/wordprocessingDrawing" xmlns:w10="urn:schemas-microsoft-com:office:word" xmlns:w="http://schemas.openxmlformats.org/wordprocessingml/2006/main" xmlns:w14="http://schemas.microsoft.com/office/word/2010/wordml" xmlns:w15="http://schemas.microsoft.com/office/word/2012/wordml" xmlns:w16cex="http://schemas.microsoft.com/office/word/2018/wordml/cex" xmlns:w16cid="http://schemas.microsoft.com/office/word/2016/wordml/cid" xmlns:w16="http://schemas.microsoft.com/office/word/2018/wordml" xmlns:w16du="http://schemas.microsoft.com/office/word/2023/wordml/word16du" xmlns:w16sdtdh="http://schemas.microsoft.com/office/word/2020/wordml/sdtdatahash" xmlns:w16sdtfl="http://schemas.microsoft.com/office/word/2024/wordml/sdtformatlock" xmlns:w16se="http://schemas.microsoft.com/office/word/2015/wordml/symex" xmlns:wpg="http://schemas.microsoft.com/office/word/2010/wordprocessingGroup" xmlns:wpi="http://schemas.microsoft.com/office/word/2010/wordprocessingInk" xmlns:wne="http://schemas.microsoft.com/office/word/2006/wordml" xmlns:wps="http://schemas.microsoft.com/office/word/2010/wordprocessingShape" mc:Ignorable="w14 w15 w16se w16cid w16 w16cex w16sdtdh w16sdtfl w16du wp14">
   <w:footnote w:type="separator" w:id="-1">
     <w:p>
       <w:r>
@@ -6970,7 +6790,7 @@
 </file>
 
 <file path=word/header1.xml><?xml version="1.0" encoding="utf-8"?>
-<w:hdr xmlns:wpc="http://schemas.microsoft.com/office/word/2010/wordprocessingCanvas" xmlns:cx="http://schemas.microsoft.com/office/drawing/2014/chartex" xmlns:cx1="http://schemas.microsoft.com/office/drawing/2015/9/8/chartex" xmlns:cx2="http://schemas.microsoft.com/office/drawing/2015/10/21/chartex" xmlns:cx3="http://schemas.microsoft.com/office/drawing/2016/5/9/chartex" xmlns:cx4="http://schemas.microsoft.com/office/drawing/2016/5/10/chartex" xmlns:cx5="http://schemas.microsoft.com/office/drawing/2016/5/11/chartex" xmlns:cx6="http://schemas.microsoft.com/office/drawing/2016/5/12/chartex" xmlns:cx7="http://schemas.microsoft.com/office/drawing/2016/5/13/chartex" xmlns:cx8="http://schemas.microsoft.com/office/drawing/2016/5/14/chartex" xmlns:mc="http://schemas.openxmlformats.org/markup-compatibility/2006" xmlns:aink="http://schemas.microsoft.com/office/drawing/2016/ink" xmlns:am3d="http://schemas.microsoft.com/office/drawing/2017/model3d" xmlns:o="urn:schemas-microsoft-com:office:office" xmlns:oel="http://schemas.microsoft.com/office/2019/extlst" xmlns:r="http://schemas.openxmlformats.org/officeDocument/2006/relationships" xmlns:m="http://schemas.openxmlformats.org/officeDocument/2006/math" xmlns:v="urn:schemas-microsoft-com:vml" xmlns:wp14="http://schemas.microsoft.com/office/word/2010/wordprocessingDrawing" xmlns:wp="http://schemas.openxmlformats.org/drawingml/2006/wordprocessingDrawing" xmlns:w10="urn:schemas-microsoft-com:office:word" xmlns:w="http://schemas.openxmlformats.org/wordprocessingml/2006/main" xmlns:w14="http://schemas.microsoft.com/office/word/2010/wordml" xmlns:w15="http://schemas.microsoft.com/office/word/2012/wordml" xmlns:w16cex="http://schemas.microsoft.com/office/word/2018/wordml/cex" xmlns:w16cid="http://schemas.microsoft.com/office/word/2016/wordml/cid" xmlns:w16="http://schemas.microsoft.com/office/word/2018/wordml" xmlns:w16sdtdh="http://schemas.microsoft.com/office/word/2020/wordml/sdtdatahash" xmlns:w16se="http://schemas.microsoft.com/office/word/2015/wordml/symex" xmlns:wpg="http://schemas.microsoft.com/office/word/2010/wordprocessingGroup" xmlns:wpi="http://schemas.microsoft.com/office/word/2010/wordprocessingInk" xmlns:wne="http://schemas.microsoft.com/office/word/2006/wordml" xmlns:wps="http://schemas.microsoft.com/office/word/2010/wordprocessingShape" mc:Ignorable="w14 w15 w16se w16cid w16 w16cex w16sdtdh wp14">
+<w:hdr xmlns:wpc="http://schemas.microsoft.com/office/word/2010/wordprocessingCanvas" xmlns:cx="http://schemas.microsoft.com/office/drawing/2014/chartex" xmlns:cx1="http://schemas.microsoft.com/office/drawing/2015/9/8/chartex" xmlns:cx2="http://schemas.microsoft.com/office/drawing/2015/10/21/chartex" xmlns:cx3="http://schemas.microsoft.com/office/drawing/2016/5/9/chartex" xmlns:cx4="http://schemas.microsoft.com/office/drawing/2016/5/10/chartex" xmlns:cx5="http://schemas.microsoft.com/office/drawing/2016/5/11/chartex" xmlns:cx6="http://schemas.microsoft.com/office/drawing/2016/5/12/chartex" xmlns:cx7="http://schemas.microsoft.com/office/drawing/2016/5/13/chartex" xmlns:cx8="http://schemas.microsoft.com/office/drawing/2016/5/14/chartex" xmlns:mc="http://schemas.openxmlformats.org/markup-compatibility/2006" xmlns:aink="http://schemas.microsoft.com/office/drawing/2016/ink" xmlns:am3d="http://schemas.microsoft.com/office/drawing/2017/model3d" xmlns:o="urn:schemas-microsoft-com:office:office" xmlns:oel="http://schemas.microsoft.com/office/2019/extlst" xmlns:r="http://schemas.openxmlformats.org/officeDocument/2006/relationships" xmlns:m="http://schemas.openxmlformats.org/officeDocument/2006/math" xmlns:v="urn:schemas-microsoft-com:vml" xmlns:wp14="http://schemas.microsoft.com/office/word/2010/wordprocessingDrawing" xmlns:wp="http://schemas.openxmlformats.org/drawingml/2006/wordprocessingDrawing" xmlns:w10="urn:schemas-microsoft-com:office:word" xmlns:w="http://schemas.openxmlformats.org/wordprocessingml/2006/main" xmlns:w14="http://schemas.microsoft.com/office/word/2010/wordml" xmlns:w15="http://schemas.microsoft.com/office/word/2012/wordml" xmlns:w16cex="http://schemas.microsoft.com/office/word/2018/wordml/cex" xmlns:w16cid="http://schemas.microsoft.com/office/word/2016/wordml/cid" xmlns:w16="http://schemas.microsoft.com/office/word/2018/wordml" xmlns:w16du="http://schemas.microsoft.com/office/word/2023/wordml/word16du" xmlns:w16sdtdh="http://schemas.microsoft.com/office/word/2020/wordml/sdtdatahash" xmlns:w16sdtfl="http://schemas.microsoft.com/office/word/2024/wordml/sdtformatlock" xmlns:w16se="http://schemas.microsoft.com/office/word/2015/wordml/symex" xmlns:wpg="http://schemas.microsoft.com/office/word/2010/wordprocessingGroup" xmlns:wpi="http://schemas.microsoft.com/office/word/2010/wordprocessingInk" xmlns:wne="http://schemas.microsoft.com/office/word/2006/wordml" xmlns:wps="http://schemas.microsoft.com/office/word/2010/wordprocessingShape" mc:Ignorable="w14 w15 w16se w16cid w16 w16cex w16sdtdh w16sdtfl w16du wp14">
   <w:p>
     <w:pPr>
       <w:pStyle w:val="Heading1"/>
@@ -7212,7 +7032,7 @@
 </file>
 
 <file path=word/numbering.xml><?xml version="1.0" encoding="utf-8"?>
-<w:numbering xmlns:wpc="http://schemas.microsoft.com/office/word/2010/wordprocessingCanvas" xmlns:cx="http://schemas.microsoft.com/office/drawing/2014/chartex" xmlns:cx1="http://schemas.microsoft.com/office/drawing/2015/9/8/chartex" xmlns:cx2="http://schemas.microsoft.com/office/drawing/2015/10/21/chartex" xmlns:cx3="http://schemas.microsoft.com/office/drawing/2016/5/9/chartex" xmlns:cx4="http://schemas.microsoft.com/office/drawing/2016/5/10/chartex" xmlns:cx5="http://schemas.microsoft.com/office/drawing/2016/5/11/chartex" xmlns:cx6="http://schemas.microsoft.com/office/drawing/2016/5/12/chartex" xmlns:cx7="http://schemas.microsoft.com/office/drawing/2016/5/13/chartex" xmlns:cx8="http://schemas.microsoft.com/office/drawing/2016/5/14/chartex" xmlns:mc="http://schemas.openxmlformats.org/markup-compatibility/2006" xmlns:aink="http://schemas.microsoft.com/office/drawing/2016/ink" xmlns:am3d="http://schemas.microsoft.com/office/drawing/2017/model3d" xmlns:o="urn:schemas-microsoft-com:office:office" xmlns:oel="http://schemas.microsoft.com/office/2019/extlst" xmlns:r="http://schemas.openxmlformats.org/officeDocument/2006/relationships" xmlns:m="http://schemas.openxmlformats.org/officeDocument/2006/math" xmlns:v="urn:schemas-microsoft-com:vml" xmlns:wp14="http://schemas.microsoft.com/office/word/2010/wordprocessingDrawing" xmlns:wp="http://schemas.openxmlformats.org/drawingml/2006/wordprocessingDrawing" xmlns:w10="urn:schemas-microsoft-com:office:word" xmlns:w="http://schemas.openxmlformats.org/wordprocessingml/2006/main" xmlns:w14="http://schemas.microsoft.com/office/word/2010/wordml" xmlns:w15="http://schemas.microsoft.com/office/word/2012/wordml" xmlns:w16cex="http://schemas.microsoft.com/office/word/2018/wordml/cex" xmlns:w16cid="http://schemas.microsoft.com/office/word/2016/wordml/cid" xmlns:w16="http://schemas.microsoft.com/office/word/2018/wordml" xmlns:w16sdtdh="http://schemas.microsoft.com/office/word/2020/wordml/sdtdatahash" xmlns:w16se="http://schemas.microsoft.com/office/word/2015/wordml/symex" xmlns:wpg="http://schemas.microsoft.com/office/word/2010/wordprocessingGroup" xmlns:wpi="http://schemas.microsoft.com/office/word/2010/wordprocessingInk" xmlns:wne="http://schemas.microsoft.com/office/word/2006/wordml" xmlns:wps="http://schemas.microsoft.com/office/word/2010/wordprocessingShape" mc:Ignorable="w14 w15 w16se w16cid w16 w16cex w16sdtdh wp14">
+<w:numbering xmlns:wpc="http://schemas.microsoft.com/office/word/2010/wordprocessingCanvas" xmlns:cx="http://schemas.microsoft.com/office/drawing/2014/chartex" xmlns:cx1="http://schemas.microsoft.com/office/drawing/2015/9/8/chartex" xmlns:cx2="http://schemas.microsoft.com/office/drawing/2015/10/21/chartex" xmlns:cx3="http://schemas.microsoft.com/office/drawing/2016/5/9/chartex" xmlns:cx4="http://schemas.microsoft.com/office/drawing/2016/5/10/chartex" xmlns:cx5="http://schemas.microsoft.com/office/drawing/2016/5/11/chartex" xmlns:cx6="http://schemas.microsoft.com/office/drawing/2016/5/12/chartex" xmlns:cx7="http://schemas.microsoft.com/office/drawing/2016/5/13/chartex" xmlns:cx8="http://schemas.microsoft.com/office/drawing/2016/5/14/chartex" xmlns:mc="http://schemas.openxmlformats.org/markup-compatibility/2006" xmlns:aink="http://schemas.microsoft.com/office/drawing/2016/ink" xmlns:am3d="http://schemas.microsoft.com/office/drawing/2017/model3d" xmlns:o="urn:schemas-microsoft-com:office:office" xmlns:oel="http://schemas.microsoft.com/office/2019/extlst" xmlns:r="http://schemas.openxmlformats.org/officeDocument/2006/relationships" xmlns:m="http://schemas.openxmlformats.org/officeDocument/2006/math" xmlns:v="urn:schemas-microsoft-com:vml" xmlns:wp14="http://schemas.microsoft.com/office/word/2010/wordprocessingDrawing" xmlns:wp="http://schemas.openxmlformats.org/drawingml/2006/wordprocessingDrawing" xmlns:w10="urn:schemas-microsoft-com:office:word" xmlns:w="http://schemas.openxmlformats.org/wordprocessingml/2006/main" xmlns:w14="http://schemas.microsoft.com/office/word/2010/wordml" xmlns:w15="http://schemas.microsoft.com/office/word/2012/wordml" xmlns:w16cex="http://schemas.microsoft.com/office/word/2018/wordml/cex" xmlns:w16cid="http://schemas.microsoft.com/office/word/2016/wordml/cid" xmlns:w16="http://schemas.microsoft.com/office/word/2018/wordml" xmlns:w16du="http://schemas.microsoft.com/office/word/2023/wordml/word16du" xmlns:w16sdtdh="http://schemas.microsoft.com/office/word/2020/wordml/sdtdatahash" xmlns:w16sdtfl="http://schemas.microsoft.com/office/word/2024/wordml/sdtformatlock" xmlns:w16se="http://schemas.microsoft.com/office/word/2015/wordml/symex" xmlns:wpg="http://schemas.microsoft.com/office/word/2010/wordprocessingGroup" xmlns:wpi="http://schemas.microsoft.com/office/word/2010/wordprocessingInk" xmlns:wne="http://schemas.microsoft.com/office/word/2006/wordml" xmlns:wps="http://schemas.microsoft.com/office/word/2010/wordprocessingShape" mc:Ignorable="w14 w15 w16se w16cid w16 w16cex w16sdtdh w16sdtfl w16du wp14">
   <w:abstractNum w:abstractNumId="0" w15:restartNumberingAfterBreak="0">
     <w:nsid w:val="04711F1E"/>
     <w:multiLevelType w:val="multilevel"/>
@@ -9793,7 +9613,7 @@
 </file>
 
 <file path=word/styles.xml><?xml version="1.0" encoding="utf-8"?>
-<w:styles xmlns:mc="http://schemas.openxmlformats.org/markup-compatibility/2006" xmlns:r="http://schemas.openxmlformats.org/officeDocument/2006/relationships" xmlns:w="http://schemas.openxmlformats.org/wordprocessingml/2006/main" xmlns:w14="http://schemas.microsoft.com/office/word/2010/wordml" xmlns:w15="http://schemas.microsoft.com/office/word/2012/wordml" xmlns:w16cex="http://schemas.microsoft.com/office/word/2018/wordml/cex" xmlns:w16cid="http://schemas.microsoft.com/office/word/2016/wordml/cid" xmlns:w16="http://schemas.microsoft.com/office/word/2018/wordml" xmlns:w16sdtdh="http://schemas.microsoft.com/office/word/2020/wordml/sdtdatahash" xmlns:w16se="http://schemas.microsoft.com/office/word/2015/wordml/symex" mc:Ignorable="w14 w15 w16se w16cid w16 w16cex w16sdtdh">
+<w:styles xmlns:mc="http://schemas.openxmlformats.org/markup-compatibility/2006" xmlns:r="http://schemas.openxmlformats.org/officeDocument/2006/relationships" xmlns:w="http://schemas.openxmlformats.org/wordprocessingml/2006/main" xmlns:w14="http://schemas.microsoft.com/office/word/2010/wordml" xmlns:w15="http://schemas.microsoft.com/office/word/2012/wordml" xmlns:w16cex="http://schemas.microsoft.com/office/word/2018/wordml/cex" xmlns:w16cid="http://schemas.microsoft.com/office/word/2016/wordml/cid" xmlns:w16="http://schemas.microsoft.com/office/word/2018/wordml" xmlns:w16du="http://schemas.microsoft.com/office/word/2023/wordml/word16du" xmlns:w16sdtdh="http://schemas.microsoft.com/office/word/2020/wordml/sdtdatahash" xmlns:w16sdtfl="http://schemas.microsoft.com/office/word/2024/wordml/sdtformatlock" xmlns:w16se="http://schemas.microsoft.com/office/word/2015/wordml/symex" mc:Ignorable="w14 w15 w16se w16cid w16 w16cex w16sdtdh w16sdtfl w16du">
   <w:docDefaults>
     <w:rPrDefault>
       <w:rPr>
@@ -10668,7 +10488,7 @@
 </file>
 
 <file path=word/glossary/document.xml><?xml version="1.0" encoding="utf-8"?>
-<w:glossaryDocument xmlns:wpc="http://schemas.microsoft.com/office/word/2010/wordprocessingCanvas" xmlns:cx="http://schemas.microsoft.com/office/drawing/2014/chartex" xmlns:cx1="http://schemas.microsoft.com/office/drawing/2015/9/8/chartex" xmlns:cx2="http://schemas.microsoft.com/office/drawing/2015/10/21/chartex" xmlns:cx3="http://schemas.microsoft.com/office/drawing/2016/5/9/chartex" xmlns:cx4="http://schemas.microsoft.com/office/drawing/2016/5/10/chartex" xmlns:cx5="http://schemas.microsoft.com/office/drawing/2016/5/11/chartex" xmlns:cx6="http://schemas.microsoft.com/office/drawing/2016/5/12/chartex" xmlns:cx7="http://schemas.microsoft.com/office/drawing/2016/5/13/chartex" xmlns:cx8="http://schemas.microsoft.com/office/drawing/2016/5/14/chartex" xmlns:mc="http://schemas.openxmlformats.org/markup-compatibility/2006" xmlns:aink="http://schemas.microsoft.com/office/drawing/2016/ink" xmlns:am3d="http://schemas.microsoft.com/office/drawing/2017/model3d" xmlns:o="urn:schemas-microsoft-com:office:office" xmlns:oel="http://schemas.microsoft.com/office/2019/extlst" xmlns:r="http://schemas.openxmlformats.org/officeDocument/2006/relationships" xmlns:m="http://schemas.openxmlformats.org/officeDocument/2006/math" xmlns:v="urn:schemas-microsoft-com:vml" xmlns:wp14="http://schemas.microsoft.com/office/word/2010/wordprocessingDrawing" xmlns:wp="http://schemas.openxmlformats.org/drawingml/2006/wordprocessingDrawing" xmlns:w10="urn:schemas-microsoft-com:office:word" xmlns:w="http://schemas.openxmlformats.org/wordprocessingml/2006/main" xmlns:w14="http://schemas.microsoft.com/office/word/2010/wordml" xmlns:w15="http://schemas.microsoft.com/office/word/2012/wordml" xmlns:w16cex="http://schemas.microsoft.com/office/word/2018/wordml/cex" xmlns:w16cid="http://schemas.microsoft.com/office/word/2016/wordml/cid" xmlns:w16="http://schemas.microsoft.com/office/word/2018/wordml" xmlns:w16sdtdh="http://schemas.microsoft.com/office/word/2020/wordml/sdtdatahash" xmlns:w16se="http://schemas.microsoft.com/office/word/2015/wordml/symex" xmlns:wpg="http://schemas.microsoft.com/office/word/2010/wordprocessingGroup" xmlns:wpi="http://schemas.microsoft.com/office/word/2010/wordprocessingInk" xmlns:wne="http://schemas.microsoft.com/office/word/2006/wordml" xmlns:wps="http://schemas.microsoft.com/office/word/2010/wordprocessingShape" mc:Ignorable="w14 w15 w16se w16cid w16 w16cex w16sdtdh wp14">
+<w:glossaryDocument xmlns:wpc="http://schemas.microsoft.com/office/word/2010/wordprocessingCanvas" xmlns:cx="http://schemas.microsoft.com/office/drawing/2014/chartex" xmlns:cx1="http://schemas.microsoft.com/office/drawing/2015/9/8/chartex" xmlns:cx2="http://schemas.microsoft.com/office/drawing/2015/10/21/chartex" xmlns:cx3="http://schemas.microsoft.com/office/drawing/2016/5/9/chartex" xmlns:cx4="http://schemas.microsoft.com/office/drawing/2016/5/10/chartex" xmlns:cx5="http://schemas.microsoft.com/office/drawing/2016/5/11/chartex" xmlns:cx6="http://schemas.microsoft.com/office/drawing/2016/5/12/chartex" xmlns:cx7="http://schemas.microsoft.com/office/drawing/2016/5/13/chartex" xmlns:cx8="http://schemas.microsoft.com/office/drawing/2016/5/14/chartex" xmlns:mc="http://schemas.openxmlformats.org/markup-compatibility/2006" xmlns:aink="http://schemas.microsoft.com/office/drawing/2016/ink" xmlns:am3d="http://schemas.microsoft.com/office/drawing/2017/model3d" xmlns:o="urn:schemas-microsoft-com:office:office" xmlns:oel="http://schemas.microsoft.com/office/2019/extlst" xmlns:r="http://schemas.openxmlformats.org/officeDocument/2006/relationships" xmlns:m="http://schemas.openxmlformats.org/officeDocument/2006/math" xmlns:v="urn:schemas-microsoft-com:vml" xmlns:wp14="http://schemas.microsoft.com/office/word/2010/wordprocessingDrawing" xmlns:wp="http://schemas.openxmlformats.org/drawingml/2006/wordprocessingDrawing" xmlns:w10="urn:schemas-microsoft-com:office:word" xmlns:w="http://schemas.openxmlformats.org/wordprocessingml/2006/main" xmlns:w14="http://schemas.microsoft.com/office/word/2010/wordml" xmlns:w15="http://schemas.microsoft.com/office/word/2012/wordml" xmlns:w16cex="http://schemas.microsoft.com/office/word/2018/wordml/cex" xmlns:w16cid="http://schemas.microsoft.com/office/word/2016/wordml/cid" xmlns:w16="http://schemas.microsoft.com/office/word/2018/wordml" xmlns:w16du="http://schemas.microsoft.com/office/word/2023/wordml/word16du" xmlns:w16sdtdh="http://schemas.microsoft.com/office/word/2020/wordml/sdtdatahash" xmlns:w16sdtfl="http://schemas.microsoft.com/office/word/2024/wordml/sdtformatlock" xmlns:w16se="http://schemas.microsoft.com/office/word/2015/wordml/symex" xmlns:wpg="http://schemas.microsoft.com/office/word/2010/wordprocessingGroup" xmlns:wpi="http://schemas.microsoft.com/office/word/2010/wordprocessingInk" xmlns:wne="http://schemas.microsoft.com/office/word/2006/wordml" xmlns:wps="http://schemas.microsoft.com/office/word/2010/wordprocessingShape" mc:Ignorable="w14 w15 w16se w16cid w16 w16cex w16sdtdh w16sdtfl w16du wp14">
   <w:docParts>
     <w:docPart>
       <w:docPartPr>
@@ -10706,7 +10526,7 @@
 </file>
 
 <file path=word/glossary/fontTable.xml><?xml version="1.0" encoding="utf-8"?>
-<w:fonts xmlns:mc="http://schemas.openxmlformats.org/markup-compatibility/2006" xmlns:r="http://schemas.openxmlformats.org/officeDocument/2006/relationships" xmlns:w="http://schemas.openxmlformats.org/wordprocessingml/2006/main" xmlns:w14="http://schemas.microsoft.com/office/word/2010/wordml" xmlns:w15="http://schemas.microsoft.com/office/word/2012/wordml" xmlns:w16cex="http://schemas.microsoft.com/office/word/2018/wordml/cex" xmlns:w16cid="http://schemas.microsoft.com/office/word/2016/wordml/cid" xmlns:w16="http://schemas.microsoft.com/office/word/2018/wordml" xmlns:w16sdtdh="http://schemas.microsoft.com/office/word/2020/wordml/sdtdatahash" xmlns:w16se="http://schemas.microsoft.com/office/word/2015/wordml/symex" mc:Ignorable="w14 w15 w16se w16cid w16 w16cex w16sdtdh">
+<w:fonts xmlns:mc="http://schemas.openxmlformats.org/markup-compatibility/2006" xmlns:r="http://schemas.openxmlformats.org/officeDocument/2006/relationships" xmlns:w="http://schemas.openxmlformats.org/wordprocessingml/2006/main" xmlns:w14="http://schemas.microsoft.com/office/word/2010/wordml" xmlns:w15="http://schemas.microsoft.com/office/word/2012/wordml" xmlns:w16cex="http://schemas.microsoft.com/office/word/2018/wordml/cex" xmlns:w16cid="http://schemas.microsoft.com/office/word/2016/wordml/cid" xmlns:w16="http://schemas.microsoft.com/office/word/2018/wordml" xmlns:w16du="http://schemas.microsoft.com/office/word/2023/wordml/word16du" xmlns:w16sdtdh="http://schemas.microsoft.com/office/word/2020/wordml/sdtdatahash" xmlns:w16sdtfl="http://schemas.microsoft.com/office/word/2024/wordml/sdtformatlock" xmlns:w16se="http://schemas.microsoft.com/office/word/2015/wordml/symex" mc:Ignorable="w14 w15 w16se w16cid w16 w16cex w16sdtdh w16sdtfl w16du">
   <w:font w:name="Times New Roman">
     <w:panose1 w:val="02020603050405020304"/>
     <w:charset w:val="00"/>
@@ -10764,7 +10584,7 @@
     <w:charset w:val="00"/>
     <w:family w:val="swiss"/>
     <w:pitch w:val="variable"/>
-    <w:sig w:usb0="E4002EFF" w:usb1="C200247B" w:usb2="00000009" w:usb3="00000000" w:csb0="000001FF" w:csb1="00000000"/>
+    <w:sig w:usb0="E4002EFF" w:usb1="C000247B" w:usb2="00000009" w:usb3="00000000" w:csb0="000001FF" w:csb1="00000000"/>
   </w:font>
   <w:font w:name="Tahoma">
     <w:panose1 w:val="020B0604030504040204"/>
@@ -10804,7 +10624,7 @@
 </file>
 
 <file path=word/glossary/settings.xml><?xml version="1.0" encoding="utf-8"?>
-<w:settings xmlns:mc="http://schemas.openxmlformats.org/markup-compatibility/2006" xmlns:o="urn:schemas-microsoft-com:office:office" xmlns:r="http://schemas.openxmlformats.org/officeDocument/2006/relationships" xmlns:m="http://schemas.openxmlformats.org/officeDocument/2006/math" xmlns:v="urn:schemas-microsoft-com:vml" xmlns:w10="urn:schemas-microsoft-com:office:word" xmlns:w="http://schemas.openxmlformats.org/wordprocessingml/2006/main" xmlns:w14="http://schemas.microsoft.com/office/word/2010/wordml" xmlns:w15="http://schemas.microsoft.com/office/word/2012/wordml" xmlns:w16cex="http://schemas.microsoft.com/office/word/2018/wordml/cex" xmlns:w16cid="http://schemas.microsoft.com/office/word/2016/wordml/cid" xmlns:w16="http://schemas.microsoft.com/office/word/2018/wordml" xmlns:w16sdtdh="http://schemas.microsoft.com/office/word/2020/wordml/sdtdatahash" xmlns:w16se="http://schemas.microsoft.com/office/word/2015/wordml/symex" xmlns:sl="http://schemas.openxmlformats.org/schemaLibrary/2006/main" mc:Ignorable="w14 w15 w16se w16cid w16 w16cex w16sdtdh">
+<w:settings xmlns:mc="http://schemas.openxmlformats.org/markup-compatibility/2006" xmlns:o="urn:schemas-microsoft-com:office:office" xmlns:r="http://schemas.openxmlformats.org/officeDocument/2006/relationships" xmlns:m="http://schemas.openxmlformats.org/officeDocument/2006/math" xmlns:v="urn:schemas-microsoft-com:vml" xmlns:w10="urn:schemas-microsoft-com:office:word" xmlns:w="http://schemas.openxmlformats.org/wordprocessingml/2006/main" xmlns:w14="http://schemas.microsoft.com/office/word/2010/wordml" xmlns:w15="http://schemas.microsoft.com/office/word/2012/wordml" xmlns:w16cex="http://schemas.microsoft.com/office/word/2018/wordml/cex" xmlns:w16cid="http://schemas.microsoft.com/office/word/2016/wordml/cid" xmlns:w16="http://schemas.microsoft.com/office/word/2018/wordml" xmlns:w16du="http://schemas.microsoft.com/office/word/2023/wordml/word16du" xmlns:w16sdtdh="http://schemas.microsoft.com/office/word/2020/wordml/sdtdatahash" xmlns:w16sdtfl="http://schemas.microsoft.com/office/word/2024/wordml/sdtformatlock" xmlns:w16se="http://schemas.microsoft.com/office/word/2015/wordml/symex" xmlns:sl="http://schemas.openxmlformats.org/schemaLibrary/2006/main" mc:Ignorable="w14 w15 w16se w16cid w16 w16cex w16sdtdh w16sdtfl w16du">
   <w:view w:val="normal"/>
   <w:defaultTabStop w:val="720"/>
   <w:characterSpacingControl w:val="doNotCompress"/>
@@ -10819,6 +10639,7 @@
   </w:compat>
   <w:rsids>
     <w:rsidRoot w:val="001C0F3D"/>
+    <w:rsid w:val="000826C4"/>
     <w:rsid w:val="00082B25"/>
     <w:rsid w:val="000B325B"/>
     <w:rsid w:val="001C0F3D"/>
@@ -10836,6 +10657,7 @@
     <w:rsid w:val="00866388"/>
     <w:rsid w:val="00894C7D"/>
     <w:rsid w:val="009535F8"/>
+    <w:rsid w:val="00A82830"/>
     <w:rsid w:val="00E44F2C"/>
     <w:rsid w:val="00EF076B"/>
     <w:rsid w:val="00F0777A"/>
@@ -10864,7 +10686,7 @@
 </file>
 
 <file path=word/glossary/styles.xml><?xml version="1.0" encoding="utf-8"?>
-<w:styles xmlns:mc="http://schemas.openxmlformats.org/markup-compatibility/2006" xmlns:r="http://schemas.openxmlformats.org/officeDocument/2006/relationships" xmlns:w="http://schemas.openxmlformats.org/wordprocessingml/2006/main" xmlns:w14="http://schemas.microsoft.com/office/word/2010/wordml" xmlns:w15="http://schemas.microsoft.com/office/word/2012/wordml" xmlns:w16cex="http://schemas.microsoft.com/office/word/2018/wordml/cex" xmlns:w16cid="http://schemas.microsoft.com/office/word/2016/wordml/cid" xmlns:w16="http://schemas.microsoft.com/office/word/2018/wordml" xmlns:w16sdtdh="http://schemas.microsoft.com/office/word/2020/wordml/sdtdatahash" xmlns:w16se="http://schemas.microsoft.com/office/word/2015/wordml/symex" mc:Ignorable="w14 w15 w16se w16cid w16 w16cex w16sdtdh">
+<w:styles xmlns:mc="http://schemas.openxmlformats.org/markup-compatibility/2006" xmlns:r="http://schemas.openxmlformats.org/officeDocument/2006/relationships" xmlns:w="http://schemas.openxmlformats.org/wordprocessingml/2006/main" xmlns:w14="http://schemas.microsoft.com/office/word/2010/wordml" xmlns:w15="http://schemas.microsoft.com/office/word/2012/wordml" xmlns:w16cex="http://schemas.microsoft.com/office/word/2018/wordml/cex" xmlns:w16cid="http://schemas.microsoft.com/office/word/2016/wordml/cid" xmlns:w16="http://schemas.microsoft.com/office/word/2018/wordml" xmlns:w16du="http://schemas.microsoft.com/office/word/2023/wordml/word16du" xmlns:w16sdtdh="http://schemas.microsoft.com/office/word/2020/wordml/sdtdatahash" xmlns:w16sdtfl="http://schemas.microsoft.com/office/word/2024/wordml/sdtformatlock" xmlns:w16se="http://schemas.microsoft.com/office/word/2015/wordml/symex" mc:Ignorable="w14 w15 w16se w16cid w16 w16cex w16sdtdh w16sdtfl w16du">
   <w:docDefaults>
     <w:rPrDefault>
       <w:rPr>
@@ -11316,7 +11138,7 @@
 </file>
 
 <file path=word/glossary/webSettings.xml><?xml version="1.0" encoding="utf-8"?>
-<w:webSettings xmlns:mc="http://schemas.openxmlformats.org/markup-compatibility/2006" xmlns:r="http://schemas.openxmlformats.org/officeDocument/2006/relationships" xmlns:w="http://schemas.openxmlformats.org/wordprocessingml/2006/main" xmlns:w14="http://schemas.microsoft.com/office/word/2010/wordml" xmlns:w15="http://schemas.microsoft.com/office/word/2012/wordml" xmlns:w16cex="http://schemas.microsoft.com/office/word/2018/wordml/cex" xmlns:w16cid="http://schemas.microsoft.com/office/word/2016/wordml/cid" xmlns:w16="http://schemas.microsoft.com/office/word/2018/wordml" xmlns:w16sdtdh="http://schemas.microsoft.com/office/word/2020/wordml/sdtdatahash" xmlns:w16se="http://schemas.microsoft.com/office/word/2015/wordml/symex" mc:Ignorable="w14 w15 w16se w16cid w16 w16cex w16sdtdh">
+<w:webSettings xmlns:mc="http://schemas.openxmlformats.org/markup-compatibility/2006" xmlns:r="http://schemas.openxmlformats.org/officeDocument/2006/relationships" xmlns:w="http://schemas.openxmlformats.org/wordprocessingml/2006/main" xmlns:w14="http://schemas.microsoft.com/office/word/2010/wordml" xmlns:w15="http://schemas.microsoft.com/office/word/2012/wordml" xmlns:w16cex="http://schemas.microsoft.com/office/word/2018/wordml/cex" xmlns:w16cid="http://schemas.microsoft.com/office/word/2016/wordml/cid" xmlns:w16="http://schemas.microsoft.com/office/word/2018/wordml" xmlns:w16du="http://schemas.microsoft.com/office/word/2023/wordml/word16du" xmlns:w16sdtdh="http://schemas.microsoft.com/office/word/2020/wordml/sdtdatahash" xmlns:w16sdtfl="http://schemas.microsoft.com/office/word/2024/wordml/sdtformatlock" xmlns:w16se="http://schemas.microsoft.com/office/word/2015/wordml/symex" mc:Ignorable="w14 w15 w16se w16cid w16 w16cex w16sdtdh w16sdtfl w16du">
   <w:optimizeForBrowser/>
   <w:allowPNG/>
 </w:webSettings>
@@ -11608,36 +11430,7 @@
 </file>
 
 <file path=customXml/item1.xml><?xml version="1.0" encoding="utf-8"?>
-<p:properties xmlns:p="http://schemas.microsoft.com/office/2006/metadata/properties" xmlns:xsi="http://www.w3.org/2001/XMLSchema-instance" xmlns:pc="http://schemas.microsoft.com/office/infopath/2007/PartnerControls">
-  <documentManagement>
-    <CostCentre xmlns="c369ec6e-e776-4cfb-9aab-85bbb2d3059b">XQD Quality and Development</CostCentre>
-    <Tag xmlns="c369ec6e-e776-4cfb-9aab-85bbb2d3059b" xsi:nil="true"/>
-    <Suffix xmlns="c369ec6e-e776-4cfb-9aab-85bbb2d3059b">12</Suffix>
-    <NameKeywords xmlns="c369ec6e-e776-4cfb-9aab-85bbb2d3059b">Assessment Task Tool instruction resource instrument</NameKeywords>
-    <Corpex xmlns="c369ec6e-e776-4cfb-9aab-85bbb2d3059b">false</Corpex>
-    <ByWhom xmlns="c369ec6e-e776-4cfb-9aab-85bbb2d3059b">Manager, VET Curriculum and Quality Assurance</ByWhom>
-    <Prefix xmlns="c369ec6e-e776-4cfb-9aab-85bbb2d3059b">Form</Prefix>
-    <UploadDate xmlns="c369ec6e-e776-4cfb-9aab-85bbb2d3059b">2020-02-02T16:00:00+00:00</UploadDate>
-    <ActionRequired xmlns="c369ec6e-e776-4cfb-9aab-85bbb2d3059b">Review</ActionRequired>
-    <Links xmlns="c369ec6e-e776-4cfb-9aab-85bbb2d3059b" xsi:nil="true"/>
-    <IssueNum xmlns="c369ec6e-e776-4cfb-9aab-85bbb2d3059b" xsi:nil="true"/>
-    <Division xmlns="c369ec6e-e776-4cfb-9aab-85bbb2d3059b">Training Services</Division>
-    <IssueDate xmlns="c369ec6e-e776-4cfb-9aab-85bbb2d3059b">2020-02-02T16:00:00+00:00</IssueDate>
-    <Pathway xmlns="7f1ed7a5-13c4-4640-91cb-37295ecf9af4">Academic</Pathway>
-    <CentralStatus xmlns="c369ec6e-e776-4cfb-9aab-85bbb2d3059b" xsi:nil="true"/>
-    <ProposedTitle xmlns="c369ec6e-e776-4cfb-9aab-85bbb2d3059b">Assessment Task Tool (F122A12)</ProposedTitle>
-    <Frequently xmlns="c369ec6e-e776-4cfb-9aab-85bbb2d3059b">false</Frequently>
-    <OtherReferences xmlns="c369ec6e-e776-4cfb-9aab-85bbb2d3059b" xsi:nil="true"/>
-    <CergDate xmlns="c369ec6e-e776-4cfb-9aab-85bbb2d3059b" xsi:nil="true"/>
-    <International xmlns="c369ec6e-e776-4cfb-9aab-85bbb2d3059b" xsi:nil="true"/>
-    <Portal xmlns="c369ec6e-e776-4cfb-9aab-85bbb2d3059b">false</Portal>
-    <PolicyNum xmlns="c369ec6e-e776-4cfb-9aab-85bbb2d3059b">122</PolicyNum>
-    <CorpexDate xmlns="c369ec6e-e776-4cfb-9aab-85bbb2d3059b" xsi:nil="true"/>
-    <ReviewDate xmlns="c369ec6e-e776-4cfb-9aab-85bbb2d3059b">03/02/2021</ReviewDate>
-    <Comments xmlns="http://schemas.microsoft.com/sharepoint/v3">03/02/2020 received from Fiona Ion to upload see HPE</Comments>
-    <Cerg xmlns="c369ec6e-e776-4cfb-9aab-85bbb2d3059b" xsi:nil="true"/>
-  </documentManagement>
-</p:properties>
+<LongProperties xmlns="http://schemas.microsoft.com/office/2006/metadata/longProperties"/>
 </file>
 
 <file path=customXml/item2.xml><?xml version="1.0" encoding="utf-8"?>
@@ -11950,10 +11743,43 @@
 </file>
 
 <file path=customXml/item3.xml><?xml version="1.0" encoding="utf-8"?>
-<LongProperties xmlns="http://schemas.microsoft.com/office/2006/metadata/longProperties"/>
+<p:properties xmlns:p="http://schemas.microsoft.com/office/2006/metadata/properties" xmlns:xsi="http://www.w3.org/2001/XMLSchema-instance" xmlns:pc="http://schemas.microsoft.com/office/infopath/2007/PartnerControls">
+  <documentManagement>
+    <CostCentre xmlns="c369ec6e-e776-4cfb-9aab-85bbb2d3059b">XQD Quality and Development</CostCentre>
+    <Tag xmlns="c369ec6e-e776-4cfb-9aab-85bbb2d3059b" xsi:nil="true"/>
+    <Suffix xmlns="c369ec6e-e776-4cfb-9aab-85bbb2d3059b">12</Suffix>
+    <NameKeywords xmlns="c369ec6e-e776-4cfb-9aab-85bbb2d3059b">Assessment Task Tool instruction resource instrument</NameKeywords>
+    <Corpex xmlns="c369ec6e-e776-4cfb-9aab-85bbb2d3059b">false</Corpex>
+    <ByWhom xmlns="c369ec6e-e776-4cfb-9aab-85bbb2d3059b">Manager, VET Curriculum and Quality Assurance</ByWhom>
+    <Prefix xmlns="c369ec6e-e776-4cfb-9aab-85bbb2d3059b">Form</Prefix>
+    <UploadDate xmlns="c369ec6e-e776-4cfb-9aab-85bbb2d3059b">2020-02-02T16:00:00+00:00</UploadDate>
+    <ActionRequired xmlns="c369ec6e-e776-4cfb-9aab-85bbb2d3059b">Review</ActionRequired>
+    <Links xmlns="c369ec6e-e776-4cfb-9aab-85bbb2d3059b" xsi:nil="true"/>
+    <IssueNum xmlns="c369ec6e-e776-4cfb-9aab-85bbb2d3059b" xsi:nil="true"/>
+    <Division xmlns="c369ec6e-e776-4cfb-9aab-85bbb2d3059b">Training Services</Division>
+    <IssueDate xmlns="c369ec6e-e776-4cfb-9aab-85bbb2d3059b">2020-02-02T16:00:00+00:00</IssueDate>
+    <Pathway xmlns="7f1ed7a5-13c4-4640-91cb-37295ecf9af4">Academic</Pathway>
+    <CentralStatus xmlns="c369ec6e-e776-4cfb-9aab-85bbb2d3059b" xsi:nil="true"/>
+    <ProposedTitle xmlns="c369ec6e-e776-4cfb-9aab-85bbb2d3059b">Assessment Task Tool (F122A12)</ProposedTitle>
+    <Frequently xmlns="c369ec6e-e776-4cfb-9aab-85bbb2d3059b">false</Frequently>
+    <OtherReferences xmlns="c369ec6e-e776-4cfb-9aab-85bbb2d3059b" xsi:nil="true"/>
+    <CergDate xmlns="c369ec6e-e776-4cfb-9aab-85bbb2d3059b" xsi:nil="true"/>
+    <International xmlns="c369ec6e-e776-4cfb-9aab-85bbb2d3059b" xsi:nil="true"/>
+    <Portal xmlns="c369ec6e-e776-4cfb-9aab-85bbb2d3059b">false</Portal>
+    <PolicyNum xmlns="c369ec6e-e776-4cfb-9aab-85bbb2d3059b">122</PolicyNum>
+    <CorpexDate xmlns="c369ec6e-e776-4cfb-9aab-85bbb2d3059b" xsi:nil="true"/>
+    <ReviewDate xmlns="c369ec6e-e776-4cfb-9aab-85bbb2d3059b">03/02/2021</ReviewDate>
+    <Comments xmlns="http://schemas.microsoft.com/sharepoint/v3">03/02/2020 received from Fiona Ion to upload see HPE</Comments>
+    <Cerg xmlns="c369ec6e-e776-4cfb-9aab-85bbb2d3059b" xsi:nil="true"/>
+  </documentManagement>
+</p:properties>
 </file>
 
 <file path=customXml/item4.xml><?xml version="1.0" encoding="utf-8"?>
+<b:Sources xmlns:b="http://schemas.openxmlformats.org/officeDocument/2006/bibliography" xmlns="http://schemas.openxmlformats.org/officeDocument/2006/bibliography" SelectedStyle="\APA.XSL" StyleName="APA"/>
+</file>
+
+<file path=customXml/item5.xml><?xml version="1.0" encoding="utf-8"?>
 <?mso-contentType ?>
 <FormTemplates xmlns="http://schemas.microsoft.com/sharepoint/v3/contenttype/forms">
   <Display>DocumentLibraryForm</Display>
@@ -11962,18 +11788,10 @@
 </FormTemplates>
 </file>
 
-<file path=customXml/item5.xml><?xml version="1.0" encoding="utf-8"?>
-<b:Sources xmlns:b="http://schemas.openxmlformats.org/officeDocument/2006/bibliography" xmlns="http://schemas.openxmlformats.org/officeDocument/2006/bibliography" SelectedStyle="\APA.XSL" StyleName="APA"/>
-</file>
-
 <file path=customXml/itemProps1.xml><?xml version="1.0" encoding="utf-8"?>
-<ds:datastoreItem xmlns:ds="http://schemas.openxmlformats.org/officeDocument/2006/customXml" ds:itemID="{A16F99D5-FAF9-47B7-BB2E-CAC1EF9F3B71}">
+<ds:datastoreItem xmlns:ds="http://schemas.openxmlformats.org/officeDocument/2006/customXml" ds:itemID="{ED9C3AC7-65F6-444B-AAD9-BED76FF91658}">
   <ds:schemaRefs>
-    <ds:schemaRef ds:uri="http://schemas.microsoft.com/office/2006/metadata/properties"/>
-    <ds:schemaRef ds:uri="http://schemas.microsoft.com/office/infopath/2007/PartnerControls"/>
-    <ds:schemaRef ds:uri="c369ec6e-e776-4cfb-9aab-85bbb2d3059b"/>
-    <ds:schemaRef ds:uri="7f1ed7a5-13c4-4640-91cb-37295ecf9af4"/>
-    <ds:schemaRef ds:uri="http://schemas.microsoft.com/sharepoint/v3"/>
+    <ds:schemaRef ds:uri="http://schemas.microsoft.com/office/2006/metadata/longProperties"/>
   </ds:schemaRefs>
 </ds:datastoreItem>
 </file>
@@ -11999,25 +11817,29 @@
 </file>
 
 <file path=customXml/itemProps3.xml><?xml version="1.0" encoding="utf-8"?>
-<ds:datastoreItem xmlns:ds="http://schemas.openxmlformats.org/officeDocument/2006/customXml" ds:itemID="{ED9C3AC7-65F6-444B-AAD9-BED76FF91658}">
+<ds:datastoreItem xmlns:ds="http://schemas.openxmlformats.org/officeDocument/2006/customXml" ds:itemID="{A16F99D5-FAF9-47B7-BB2E-CAC1EF9F3B71}">
   <ds:schemaRefs>
-    <ds:schemaRef ds:uri="http://schemas.microsoft.com/office/2006/metadata/longProperties"/>
+    <ds:schemaRef ds:uri="http://schemas.microsoft.com/office/2006/metadata/properties"/>
+    <ds:schemaRef ds:uri="http://schemas.microsoft.com/office/infopath/2007/PartnerControls"/>
+    <ds:schemaRef ds:uri="c369ec6e-e776-4cfb-9aab-85bbb2d3059b"/>
+    <ds:schemaRef ds:uri="7f1ed7a5-13c4-4640-91cb-37295ecf9af4"/>
+    <ds:schemaRef ds:uri="http://schemas.microsoft.com/sharepoint/v3"/>
   </ds:schemaRefs>
 </ds:datastoreItem>
 </file>
 
 <file path=customXml/itemProps4.xml><?xml version="1.0" encoding="utf-8"?>
+<ds:datastoreItem xmlns:ds="http://schemas.openxmlformats.org/officeDocument/2006/customXml" ds:itemID="{270A1387-5032-421F-ABE8-3776CE5E5F42}">
+  <ds:schemaRefs>
+    <ds:schemaRef ds:uri="http://schemas.openxmlformats.org/officeDocument/2006/bibliography"/>
+  </ds:schemaRefs>
+</ds:datastoreItem>
+</file>
+
+<file path=customXml/itemProps5.xml><?xml version="1.0" encoding="utf-8"?>
 <ds:datastoreItem xmlns:ds="http://schemas.openxmlformats.org/officeDocument/2006/customXml" ds:itemID="{96001339-1F25-4BDD-94F9-AA3400008571}">
   <ds:schemaRefs>
     <ds:schemaRef ds:uri="http://schemas.microsoft.com/sharepoint/v3/contenttype/forms"/>
   </ds:schemaRefs>
 </ds:datastoreItem>
-</file>
-
-<file path=customXml/itemProps5.xml><?xml version="1.0" encoding="utf-8"?>
-<ds:datastoreItem xmlns:ds="http://schemas.openxmlformats.org/officeDocument/2006/customXml" ds:itemID="{270A1387-5032-421F-ABE8-3776CE5E5F42}">
-  <ds:schemaRefs>
-    <ds:schemaRef ds:uri="http://schemas.openxmlformats.org/officeDocument/2006/bibliography"/>
-  </ds:schemaRefs>
-</ds:datastoreItem>
 </file>
</xml_diff>